<commit_message>
Rename AP to Birley in file names, titles and headers; replace photo with Eton crest
- 15 apps and 8 Word guides renamed AP -> Birley (git renames keep history)
- App titles, headers, print headings and guide titles/links now say Birley
- Header circle photo replaced by the Eton College crest in every app
- versions.json and each app's build hash refreshed for auto-update
- Small redirect pages left at the old "AP ..." addresses so links already
  given out (and saved test links) keep working
- Olly guide PDF regenerated from the updated Word guide

Co-Authored-By: Claude Sonnet 5.5 <noreply@anthropic.com>
Claude-Session: https://claude.ai/code/session_01PtLNqJ6dBkTLNoYddvJHKa
</commit_message>
<xml_diff>
--- a/Word documents/Olly_French_Italian_Guide.docx
+++ b/Word documents/Olly_French_Italian_Guide.docx
@@ -323,7 +323,7 @@
             <w:szCs w:val="24"/>
             <w:u w:val="single"/>
           </w:rPr>
-          <w:t xml:space="preserve">▶ Open AP Italian Verbs</w:t>
+          <w:t xml:space="preserve">▶ Open Birley Italian Verbs</w:t>
         </w:r>
       </w:hyperlink>
     </w:p>
@@ -338,7 +338,7 @@
           <w:sz w:val="15"/>
           <w:szCs w:val="15"/>
         </w:rPr>
-        <w:t xml:space="preserve">https://apowles.github.io/AP/AP%20Italian%20Verbs.html</w:t>
+        <w:t xml:space="preserve">https://apowles.github.io/AP/Birley%20Italian%20Verbs.html</w:t>
       </w:r>
     </w:p>
     <w:p>
@@ -625,7 +625,7 @@
             <w:szCs w:val="24"/>
             <w:u w:val="single"/>
           </w:rPr>
-          <w:t xml:space="preserve">▶ Open AP French Verbs</w:t>
+          <w:t xml:space="preserve">▶ Open Birley French Verbs</w:t>
         </w:r>
       </w:hyperlink>
     </w:p>
@@ -640,7 +640,7 @@
           <w:sz w:val="15"/>
           <w:szCs w:val="15"/>
         </w:rPr>
-        <w:t xml:space="preserve">https://apowles.github.io/AP/AP%20French%20Verbs.html</w:t>
+        <w:t xml:space="preserve">https://apowles.github.io/AP/Birley%20French%20Verbs.html</w:t>
       </w:r>
     </w:p>
     <w:p>
@@ -855,7 +855,7 @@
             <w:szCs w:val="24"/>
             <w:u w:val="single"/>
           </w:rPr>
-          <w:t xml:space="preserve">▶ Open AP IGCSE Vocab and Gr EWs (then press 📘 Gr EWs, then 🇮🇹 Italian)</w:t>
+          <w:t xml:space="preserve">▶ Open Birley IGCSE Vocab and Gr EWs (then press 📘 Gr EWs, then 🇮🇹 Italian)</w:t>
         </w:r>
       </w:hyperlink>
     </w:p>
@@ -870,7 +870,7 @@
           <w:sz w:val="15"/>
           <w:szCs w:val="15"/>
         </w:rPr>
-        <w:t xml:space="preserve">https://apowles.github.io/AP/AP%20IGCSE%20Vocab%20and%20Gr%20EWs.html</w:t>
+        <w:t xml:space="preserve">https://apowles.github.io/AP/Birley%20IGCSE%20Vocab%20and%20Gr%20EWs.html</w:t>
       </w:r>
     </w:p>
     <w:p>
@@ -1543,7 +1543,7 @@
             <w:szCs w:val="24"/>
             <w:u w:val="single"/>
           </w:rPr>
-          <w:t xml:space="preserve">▶ Open AP Italian Verbs</w:t>
+          <w:t xml:space="preserve">▶ Open Birley Italian Verbs</w:t>
         </w:r>
       </w:hyperlink>
     </w:p>
@@ -1558,7 +1558,7 @@
           <w:sz w:val="15"/>
           <w:szCs w:val="15"/>
         </w:rPr>
-        <w:t xml:space="preserve">https://apowles.github.io/AP/AP%20Italian%20Verbs.html</w:t>
+        <w:t xml:space="preserve">https://apowles.github.io/AP/Birley%20Italian%20Verbs.html</w:t>
       </w:r>
     </w:p>
     <w:p>
@@ -1872,7 +1872,7 @@
             <w:szCs w:val="24"/>
             <w:u w:val="single"/>
           </w:rPr>
-          <w:t xml:space="preserve">▶ Open AP IGCSE Vocab and Gr EWs</w:t>
+          <w:t xml:space="preserve">▶ Open Birley IGCSE Vocab and Gr EWs</w:t>
         </w:r>
       </w:hyperlink>
     </w:p>
@@ -1887,7 +1887,7 @@
           <w:sz w:val="15"/>
           <w:szCs w:val="15"/>
         </w:rPr>
-        <w:t xml:space="preserve">https://apowles.github.io/AP/AP%20IGCSE%20Vocab%20and%20Gr%20EWs.html</w:t>
+        <w:t xml:space="preserve">https://apowles.github.io/AP/Birley%20IGCSE%20Vocab%20and%20Gr%20EWs.html</w:t>
       </w:r>
     </w:p>
     <w:p>
@@ -2631,7 +2631,7 @@
             <w:szCs w:val="24"/>
             <w:u w:val="single"/>
           </w:rPr>
-          <w:t xml:space="preserve">▶ Open AP IGCSE Vocab and Gr EWs</w:t>
+          <w:t xml:space="preserve">▶ Open Birley IGCSE Vocab and Gr EWs</w:t>
         </w:r>
       </w:hyperlink>
     </w:p>
@@ -2646,7 +2646,7 @@
           <w:sz w:val="15"/>
           <w:szCs w:val="15"/>
         </w:rPr>
-        <w:t xml:space="preserve">https://apowles.github.io/AP/AP%20IGCSE%20Vocab%20and%20Gr%20EWs.html</w:t>
+        <w:t xml:space="preserve">https://apowles.github.io/AP/Birley%20IGCSE%20Vocab%20and%20Gr%20EWs.html</w:t>
       </w:r>
     </w:p>
     <w:p>
@@ -2976,7 +2976,7 @@
             <w:szCs w:val="24"/>
             <w:u w:val="single"/>
           </w:rPr>
-          <w:t xml:space="preserve">▶ Open AP IGCSE Structures &amp; Oral</w:t>
+          <w:t xml:space="preserve">▶ Open Birley IGCSE Structures &amp; Oral</w:t>
         </w:r>
       </w:hyperlink>
     </w:p>
@@ -2991,7 +2991,7 @@
           <w:sz w:val="15"/>
           <w:szCs w:val="15"/>
         </w:rPr>
-        <w:t xml:space="preserve">https://apowles.github.io/AP/AP%20IGCSE%20AP%20Structures%20%26%20Oral%20and%20Writing%20Practice.html</w:t>
+        <w:t xml:space="preserve">https://apowles.github.io/AP/Birley%20IGCSE%20Structures%20%26%20Oral%20and%20Writing%20Practice.html</w:t>
       </w:r>
     </w:p>
     <w:p>
@@ -3231,7 +3231,7 @@
             <w:szCs w:val="24"/>
             <w:u w:val="single"/>
           </w:rPr>
-          <w:t xml:space="preserve">▶ Open AP A Level Oral Phrase Bank</w:t>
+          <w:t xml:space="preserve">▶ Open Birley A Level Oral Phrase Bank</w:t>
         </w:r>
       </w:hyperlink>
     </w:p>
@@ -3246,7 +3246,7 @@
           <w:sz w:val="15"/>
           <w:szCs w:val="15"/>
         </w:rPr>
-        <w:t xml:space="preserve">https://apowles.github.io/AP/AP%20A%20Level%20Oral%20Phrase%20Bank.html</w:t>
+        <w:t xml:space="preserve">https://apowles.github.io/AP/Birley%20A%20Level%20Oral%20Phrase%20Bank.html</w:t>
       </w:r>
     </w:p>
     <w:p>
@@ -3382,7 +3382,7 @@
           <w:sz w:val="22"/>
           <w:szCs w:val="22"/>
         </w:rPr>
-        <w:t xml:space="preserve">AP Essential Phrases</w:t>
+        <w:t xml:space="preserve">Birley Essential Phrases</w:t>
       </w:r>
       <w:r>
         <w:rPr>
@@ -3432,7 +3432,7 @@
             <w:szCs w:val="24"/>
             <w:u w:val="single"/>
           </w:rPr>
-          <w:t xml:space="preserve">▶ Open AP Essential Phrases</w:t>
+          <w:t xml:space="preserve">▶ Open Birley Essential Phrases</w:t>
         </w:r>
       </w:hyperlink>
     </w:p>
@@ -3447,7 +3447,7 @@
           <w:sz w:val="15"/>
           <w:szCs w:val="15"/>
         </w:rPr>
-        <w:t xml:space="preserve">https://apowles.github.io/AP/AP%20Gen%20Essential%20Phrases.html</w:t>
+        <w:t xml:space="preserve">https://apowles.github.io/AP/Birley%20Gen%20Essential%20Phrases.html</w:t>
       </w:r>
     </w:p>
     <w:tbl>
@@ -3598,7 +3598,7 @@
             <w:szCs w:val="24"/>
             <w:u w:val="single"/>
           </w:rPr>
-          <w:t xml:space="preserve">▶ Open AP IGCSE Italian Listening</w:t>
+          <w:t xml:space="preserve">▶ Open Birley IGCSE Italian Listening</w:t>
         </w:r>
       </w:hyperlink>
     </w:p>
@@ -3613,7 +3613,7 @@
           <w:sz w:val="15"/>
           <w:szCs w:val="15"/>
         </w:rPr>
-        <w:t xml:space="preserve">https://apowles.github.io/AP/AP%20IGCSE%20Italian%20Listening.html</w:t>
+        <w:t xml:space="preserve">https://apowles.github.io/AP/Birley%20IGCSE%20Italian%20Listening.html</w:t>
       </w:r>
     </w:p>
     <w:p>
@@ -3641,7 +3641,7 @@
           <w:sz w:val="22"/>
           <w:szCs w:val="22"/>
         </w:rPr>
-        <w:t xml:space="preserve">AP IGCSE Italian Listening</w:t>
+        <w:t xml:space="preserve">Birley IGCSE Italian Listening</w:t>
       </w:r>
       <w:r>
         <w:rPr>
@@ -3731,7 +3731,7 @@
           <w:sz w:val="22"/>
           <w:szCs w:val="22"/>
         </w:rPr>
-        <w:t xml:space="preserve">AP IGCSE Vocab and Gr EWs</w:t>
+        <w:t xml:space="preserve">Birley IGCSE Vocab and Gr EWs</w:t>
       </w:r>
       <w:r>
         <w:rPr>
@@ -3939,7 +3939,7 @@
             <w:szCs w:val="24"/>
             <w:u w:val="single"/>
           </w:rPr>
-          <w:t xml:space="preserve">▶ Open AP French Verbs</w:t>
+          <w:t xml:space="preserve">▶ Open Birley French Verbs</w:t>
         </w:r>
       </w:hyperlink>
     </w:p>
@@ -3954,7 +3954,7 @@
           <w:sz w:val="15"/>
           <w:szCs w:val="15"/>
         </w:rPr>
-        <w:t xml:space="preserve">https://apowles.github.io/AP/AP%20French%20Verbs.html</w:t>
+        <w:t xml:space="preserve">https://apowles.github.io/AP/Birley%20French%20Verbs.html</w:t>
       </w:r>
     </w:p>
     <w:p>
@@ -4212,7 +4212,7 @@
             <w:szCs w:val="24"/>
             <w:u w:val="single"/>
           </w:rPr>
-          <w:t xml:space="preserve">▶ Open AP A Level French VVs &amp; Gr EWs &amp; Translation</w:t>
+          <w:t xml:space="preserve">▶ Open Birley A Level French VVs &amp; Gr EWs &amp; Translation</w:t>
         </w:r>
       </w:hyperlink>
     </w:p>
@@ -4227,7 +4227,7 @@
           <w:sz w:val="15"/>
           <w:szCs w:val="15"/>
         </w:rPr>
-        <w:t xml:space="preserve">https://apowles.github.io/AP/AP%20A%20Level%20French%20VVs%20%26%20Gr%20EWs%20%26%20Grammar%20Translation%20Practice%20and%20Drills.html</w:t>
+        <w:t xml:space="preserve">https://apowles.github.io/AP/Birley%20A%20Level%20French%20VVs%20%26%20Gr%20EWs%20%26%20Grammar%20Translation%20Practice%20and%20Drills.html</w:t>
       </w:r>
     </w:p>
     <w:p>
@@ -4665,7 +4665,7 @@
             <w:szCs w:val="24"/>
             <w:u w:val="single"/>
           </w:rPr>
-          <w:t xml:space="preserve">▶ Open AP A Level French VVs &amp; Gr EWs &amp; Translation</w:t>
+          <w:t xml:space="preserve">▶ Open Birley A Level French VVs &amp; Gr EWs &amp; Translation</w:t>
         </w:r>
       </w:hyperlink>
     </w:p>
@@ -4680,7 +4680,7 @@
           <w:sz w:val="15"/>
           <w:szCs w:val="15"/>
         </w:rPr>
-        <w:t xml:space="preserve">https://apowles.github.io/AP/AP%20A%20Level%20French%20VVs%20%26%20Gr%20EWs%20%26%20Grammar%20Translation%20Practice%20and%20Drills.html</w:t>
+        <w:t xml:space="preserve">https://apowles.github.io/AP/Birley%20A%20Level%20French%20VVs%20%26%20Gr%20EWs%20%26%20Grammar%20Translation%20Practice%20and%20Drills.html</w:t>
       </w:r>
     </w:p>
     <w:p>
@@ -4866,7 +4866,7 @@
             <w:szCs w:val="24"/>
             <w:u w:val="single"/>
           </w:rPr>
-          <w:t xml:space="preserve">▶ Open AP A Level French VVs &amp; Gr EWs &amp; Translation</w:t>
+          <w:t xml:space="preserve">▶ Open Birley A Level French VVs &amp; Gr EWs &amp; Translation</w:t>
         </w:r>
       </w:hyperlink>
     </w:p>
@@ -4881,7 +4881,7 @@
           <w:sz w:val="15"/>
           <w:szCs w:val="15"/>
         </w:rPr>
-        <w:t xml:space="preserve">https://apowles.github.io/AP/AP%20A%20Level%20French%20VVs%20%26%20Gr%20EWs%20%26%20Grammar%20Translation%20Practice%20and%20Drills.html</w:t>
+        <w:t xml:space="preserve">https://apowles.github.io/AP/Birley%20A%20Level%20French%20VVs%20%26%20Gr%20EWs%20%26%20Grammar%20Translation%20Practice%20and%20Drills.html</w:t>
       </w:r>
     </w:p>
     <w:p>
@@ -4964,7 +4964,7 @@
             <w:szCs w:val="24"/>
             <w:u w:val="single"/>
           </w:rPr>
-          <w:t xml:space="preserve">▶ Open AP IGCSE Vocab and Gr EWs (French vocab and GCSE grammar)</w:t>
+          <w:t xml:space="preserve">▶ Open Birley IGCSE Vocab and Gr EWs (French vocab and GCSE grammar)</w:t>
         </w:r>
       </w:hyperlink>
     </w:p>
@@ -4979,7 +4979,7 @@
           <w:sz w:val="15"/>
           <w:szCs w:val="15"/>
         </w:rPr>
-        <w:t xml:space="preserve">https://apowles.github.io/AP/AP%20IGCSE%20Vocab%20and%20Gr%20EWs.html</w:t>
+        <w:t xml:space="preserve">https://apowles.github.io/AP/Birley%20IGCSE%20Vocab%20and%20Gr%20EWs.html</w:t>
       </w:r>
     </w:p>
     <w:p>
@@ -5088,7 +5088,7 @@
             <w:szCs w:val="24"/>
             <w:u w:val="single"/>
           </w:rPr>
-          <w:t xml:space="preserve">▶ Open AP A Level French Oral Topics &amp; Paper 1</w:t>
+          <w:t xml:space="preserve">▶ Open Birley A Level French Oral Topics &amp; Paper 1</w:t>
         </w:r>
       </w:hyperlink>
     </w:p>
@@ -5103,7 +5103,7 @@
           <w:sz w:val="15"/>
           <w:szCs w:val="15"/>
         </w:rPr>
-        <w:t xml:space="preserve">https://apowles.github.io/AP/AP%20A%20Level%20French%20Oral%20Topics%20%26%20Paper%201%20Practice.html</w:t>
+        <w:t xml:space="preserve">https://apowles.github.io/AP/Birley%20A%20Level%20French%20Oral%20Topics%20%26%20Paper%201%20Practice.html</w:t>
       </w:r>
     </w:p>
     <w:p>
@@ -5505,7 +5505,7 @@
             <w:szCs w:val="24"/>
             <w:u w:val="single"/>
           </w:rPr>
-          <w:t xml:space="preserve">▶ Open AP A Level Oral Phrase Bank</w:t>
+          <w:t xml:space="preserve">▶ Open Birley A Level Oral Phrase Bank</w:t>
         </w:r>
       </w:hyperlink>
     </w:p>
@@ -5520,7 +5520,7 @@
           <w:sz w:val="15"/>
           <w:szCs w:val="15"/>
         </w:rPr>
-        <w:t xml:space="preserve">https://apowles.github.io/AP/AP%20A%20Level%20Oral%20Phrase%20Bank.html</w:t>
+        <w:t xml:space="preserve">https://apowles.github.io/AP/Birley%20A%20Level%20Oral%20Phrase%20Bank.html</w:t>
       </w:r>
     </w:p>
     <w:p>
@@ -5602,7 +5602,7 @@
           <w:sz w:val="22"/>
           <w:szCs w:val="22"/>
         </w:rPr>
-        <w:t xml:space="preserve">AP Essential Phrases</w:t>
+        <w:t xml:space="preserve">Birley Essential Phrases</w:t>
       </w:r>
       <w:r>
         <w:rPr>
@@ -5729,7 +5729,7 @@
           <w:sz w:val="15"/>
           <w:szCs w:val="15"/>
         </w:rPr>
-        <w:t xml:space="preserve">https://apowles.github.io/AP/AP%20A%20Level%20French%20VVs%20%26%20Gr%20EWs%20%26%20Grammar%20Translation%20Practice%20and%20Drills.html</w:t>
+        <w:t xml:space="preserve">https://apowles.github.io/AP/Birley%20A%20Level%20French%20VVs%20%26%20Gr%20EWs%20%26%20Grammar%20Translation%20Practice%20and%20Drills.html</w:t>
       </w:r>
     </w:p>
     <w:p>
@@ -5990,7 +5990,7 @@
                   <w:szCs w:val="20"/>
                   <w:u w:val="single"/>
                 </w:rPr>
-                <w:t xml:space="preserve">AP Italian Verbs</w:t>
+                <w:t xml:space="preserve">Birley Italian Verbs</w:t>
               </w:r>
             </w:hyperlink>
           </w:p>
@@ -6094,7 +6094,7 @@
                   <w:szCs w:val="20"/>
                   <w:u w:val="single"/>
                 </w:rPr>
-                <w:t xml:space="preserve">AP French Verbs</w:t>
+                <w:t xml:space="preserve">Birley French Verbs</w:t>
               </w:r>
             </w:hyperlink>
           </w:p>
@@ -6195,7 +6195,7 @@
                   <w:szCs w:val="20"/>
                   <w:u w:val="single"/>
                 </w:rPr>
-                <w:t xml:space="preserve">AP IGCSE Vocab and Gr EWs</w:t>
+                <w:t xml:space="preserve">Birley IGCSE Vocab and Gr EWs</w:t>
               </w:r>
             </w:hyperlink>
           </w:p>
@@ -6299,7 +6299,7 @@
                   <w:szCs w:val="20"/>
                   <w:u w:val="single"/>
                 </w:rPr>
-                <w:t xml:space="preserve">AP A Level French VVs &amp; Gr EWs &amp; Translation</w:t>
+                <w:t xml:space="preserve">Birley A Level French VVs &amp; Gr EWs &amp; Translation</w:t>
               </w:r>
             </w:hyperlink>
           </w:p>
@@ -6400,7 +6400,7 @@
                   <w:szCs w:val="20"/>
                   <w:u w:val="single"/>
                 </w:rPr>
-                <w:t xml:space="preserve">AP IGCSE Vocab and Gr EWs</w:t>
+                <w:t xml:space="preserve">Birley IGCSE Vocab and Gr EWs</w:t>
               </w:r>
             </w:hyperlink>
           </w:p>
@@ -7090,7 +7090,7 @@
             <w:szCs w:val="24"/>
             <w:u w:val="single"/>
           </w:rPr>
-          <w:t xml:space="preserve">▶ Open AP Italian Verbs</w:t>
+          <w:t xml:space="preserve">▶ Open Birley Italian Verbs</w:t>
         </w:r>
       </w:hyperlink>
     </w:p>
@@ -7105,7 +7105,7 @@
           <w:sz w:val="15"/>
           <w:szCs w:val="15"/>
         </w:rPr>
-        <w:t xml:space="preserve">https://apowles.github.io/AP/AP%20Italian%20Verbs.html</w:t>
+        <w:t xml:space="preserve">https://apowles.github.io/AP/Birley%20Italian%20Verbs.html</w:t>
       </w:r>
     </w:p>
     <w:p>
@@ -7124,7 +7124,7 @@
             <w:szCs w:val="24"/>
             <w:u w:val="single"/>
           </w:rPr>
-          <w:t xml:space="preserve">▶ Open AP French Verbs</w:t>
+          <w:t xml:space="preserve">▶ Open Birley French Verbs</w:t>
         </w:r>
       </w:hyperlink>
     </w:p>
@@ -7139,7 +7139,7 @@
           <w:sz w:val="15"/>
           <w:szCs w:val="15"/>
         </w:rPr>
-        <w:t xml:space="preserve">https://apowles.github.io/AP/AP%20French%20Verbs.html</w:t>
+        <w:t xml:space="preserve">https://apowles.github.io/AP/Birley%20French%20Verbs.html</w:t>
       </w:r>
     </w:p>
     <w:p>
@@ -7158,7 +7158,7 @@
             <w:szCs w:val="24"/>
             <w:u w:val="single"/>
           </w:rPr>
-          <w:t xml:space="preserve">▶ Open AP IGCSE Vocab and Gr EWs</w:t>
+          <w:t xml:space="preserve">▶ Open Birley IGCSE Vocab and Gr EWs</w:t>
         </w:r>
       </w:hyperlink>
     </w:p>
@@ -7173,7 +7173,7 @@
           <w:sz w:val="15"/>
           <w:szCs w:val="15"/>
         </w:rPr>
-        <w:t xml:space="preserve">https://apowles.github.io/AP/AP%20IGCSE%20Vocab%20and%20Gr%20EWs.html</w:t>
+        <w:t xml:space="preserve">https://apowles.github.io/AP/Birley%20IGCSE%20Vocab%20and%20Gr%20EWs.html</w:t>
       </w:r>
     </w:p>
     <w:p>
@@ -7192,7 +7192,7 @@
             <w:szCs w:val="24"/>
             <w:u w:val="single"/>
           </w:rPr>
-          <w:t xml:space="preserve">▶ Open AP IGCSE Structures &amp; Oral</w:t>
+          <w:t xml:space="preserve">▶ Open Birley IGCSE Structures &amp; Oral</w:t>
         </w:r>
       </w:hyperlink>
     </w:p>
@@ -7207,7 +7207,7 @@
           <w:sz w:val="15"/>
           <w:szCs w:val="15"/>
         </w:rPr>
-        <w:t xml:space="preserve">https://apowles.github.io/AP/AP%20IGCSE%20AP%20Structures%20%26%20Oral%20and%20Writing%20Practice.html</w:t>
+        <w:t xml:space="preserve">https://apowles.github.io/AP/Birley%20IGCSE%20Structures%20%26%20Oral%20and%20Writing%20Practice.html</w:t>
       </w:r>
     </w:p>
     <w:p>
@@ -7226,7 +7226,7 @@
             <w:szCs w:val="24"/>
             <w:u w:val="single"/>
           </w:rPr>
-          <w:t xml:space="preserve">▶ Open AP A Level Oral Phrase Bank</w:t>
+          <w:t xml:space="preserve">▶ Open Birley A Level Oral Phrase Bank</w:t>
         </w:r>
       </w:hyperlink>
     </w:p>
@@ -7241,7 +7241,7 @@
           <w:sz w:val="15"/>
           <w:szCs w:val="15"/>
         </w:rPr>
-        <w:t xml:space="preserve">https://apowles.github.io/AP/AP%20A%20Level%20Oral%20Phrase%20Bank.html</w:t>
+        <w:t xml:space="preserve">https://apowles.github.io/AP/Birley%20A%20Level%20Oral%20Phrase%20Bank.html</w:t>
       </w:r>
     </w:p>
     <w:p>
@@ -7260,7 +7260,7 @@
             <w:szCs w:val="24"/>
             <w:u w:val="single"/>
           </w:rPr>
-          <w:t xml:space="preserve">▶ Open AP Essential Phrases</w:t>
+          <w:t xml:space="preserve">▶ Open Birley Essential Phrases</w:t>
         </w:r>
       </w:hyperlink>
     </w:p>
@@ -7275,7 +7275,7 @@
           <w:sz w:val="15"/>
           <w:szCs w:val="15"/>
         </w:rPr>
-        <w:t xml:space="preserve">https://apowles.github.io/AP/AP%20Gen%20Essential%20Phrases.html</w:t>
+        <w:t xml:space="preserve">https://apowles.github.io/AP/Birley%20Gen%20Essential%20Phrases.html</w:t>
       </w:r>
     </w:p>
     <w:p>
@@ -7294,7 +7294,7 @@
             <w:szCs w:val="24"/>
             <w:u w:val="single"/>
           </w:rPr>
-          <w:t xml:space="preserve">▶ Open AP A Level French VVs &amp; Gr EWs &amp; Translation</w:t>
+          <w:t xml:space="preserve">▶ Open Birley A Level French VVs &amp; Gr EWs &amp; Translation</w:t>
         </w:r>
       </w:hyperlink>
     </w:p>
@@ -7309,7 +7309,7 @@
           <w:sz w:val="15"/>
           <w:szCs w:val="15"/>
         </w:rPr>
-        <w:t xml:space="preserve">https://apowles.github.io/AP/AP%20A%20Level%20French%20VVs%20%26%20Gr%20EWs%20%26%20Grammar%20Translation%20Practice%20and%20Drills.html</w:t>
+        <w:t xml:space="preserve">https://apowles.github.io/AP/Birley%20A%20Level%20French%20VVs%20%26%20Gr%20EWs%20%26%20Grammar%20Translation%20Practice%20and%20Drills.html</w:t>
       </w:r>
     </w:p>
     <w:p>
@@ -7328,7 +7328,7 @@
             <w:szCs w:val="24"/>
             <w:u w:val="single"/>
           </w:rPr>
-          <w:t xml:space="preserve">▶ Open AP A Level French Oral Topics &amp; Paper 1</w:t>
+          <w:t xml:space="preserve">▶ Open Birley A Level French Oral Topics &amp; Paper 1</w:t>
         </w:r>
       </w:hyperlink>
     </w:p>
@@ -7343,7 +7343,7 @@
           <w:sz w:val="15"/>
           <w:szCs w:val="15"/>
         </w:rPr>
-        <w:t xml:space="preserve">https://apowles.github.io/AP/AP%20A%20Level%20French%20Oral%20Topics%20%26%20Paper%201%20Practice.html</w:t>
+        <w:t xml:space="preserve">https://apowles.github.io/AP/Birley%20A%20Level%20French%20Oral%20Topics%20%26%20Paper%201%20Practice.html</w:t>
       </w:r>
     </w:p>
     <w:p>
@@ -7362,7 +7362,7 @@
             <w:szCs w:val="24"/>
             <w:u w:val="single"/>
           </w:rPr>
-          <w:t xml:space="preserve">▶ Open AP IGCSE Italian Listening</w:t>
+          <w:t xml:space="preserve">▶ Open Birley IGCSE Italian Listening</w:t>
         </w:r>
       </w:hyperlink>
     </w:p>
@@ -7377,7 +7377,7 @@
           <w:sz w:val="15"/>
           <w:szCs w:val="15"/>
         </w:rPr>
-        <w:t xml:space="preserve">https://apowles.github.io/AP/AP%20IGCSE%20Italian%20Listening.html</w:t>
+        <w:t xml:space="preserve">https://apowles.github.io/AP/Birley%20IGCSE%20Italian%20Listening.html</w:t>
       </w:r>
     </w:p>
     <w:p>

</xml_diff>

<commit_message>
Use Eton instead of Birley in file names, titles, headers and guides
The classroom name "Birley 12" in the teaching text is unchanged.
Old "AP ..." addresses still redirect, now to the Eton pages.

Co-Authored-By: Claude Sonnet 5.5 <noreply@anthropic.com>
Claude-Session: https://claude.ai/code/session_01PtLNqJ6dBkTLNoYddvJHKa
</commit_message>
<xml_diff>
--- a/Word documents/Olly_French_Italian_Guide.docx
+++ b/Word documents/Olly_French_Italian_Guide.docx
@@ -323,7 +323,7 @@
             <w:szCs w:val="24"/>
             <w:u w:val="single"/>
           </w:rPr>
-          <w:t xml:space="preserve">▶ Open Birley Italian Verbs</w:t>
+          <w:t xml:space="preserve">▶ Open Eton Italian Verbs</w:t>
         </w:r>
       </w:hyperlink>
     </w:p>
@@ -338,7 +338,7 @@
           <w:sz w:val="15"/>
           <w:szCs w:val="15"/>
         </w:rPr>
-        <w:t xml:space="preserve">https://apowles.github.io/AP/Birley%20Italian%20Verbs.html</w:t>
+        <w:t xml:space="preserve">https://apowles.github.io/AP/Eton%20Italian%20Verbs.html</w:t>
       </w:r>
     </w:p>
     <w:p>
@@ -625,7 +625,7 @@
             <w:szCs w:val="24"/>
             <w:u w:val="single"/>
           </w:rPr>
-          <w:t xml:space="preserve">▶ Open Birley French Verbs</w:t>
+          <w:t xml:space="preserve">▶ Open Eton French Verbs</w:t>
         </w:r>
       </w:hyperlink>
     </w:p>
@@ -640,7 +640,7 @@
           <w:sz w:val="15"/>
           <w:szCs w:val="15"/>
         </w:rPr>
-        <w:t xml:space="preserve">https://apowles.github.io/AP/Birley%20French%20Verbs.html</w:t>
+        <w:t xml:space="preserve">https://apowles.github.io/AP/Eton%20French%20Verbs.html</w:t>
       </w:r>
     </w:p>
     <w:p>
@@ -855,7 +855,7 @@
             <w:szCs w:val="24"/>
             <w:u w:val="single"/>
           </w:rPr>
-          <w:t xml:space="preserve">▶ Open Birley IGCSE Vocab and Gr EWs (then press 📘 Gr EWs, then 🇮🇹 Italian)</w:t>
+          <w:t xml:space="preserve">▶ Open Eton IGCSE Vocab and Gr EWs (then press 📘 Gr EWs, then 🇮🇹 Italian)</w:t>
         </w:r>
       </w:hyperlink>
     </w:p>
@@ -870,7 +870,7 @@
           <w:sz w:val="15"/>
           <w:szCs w:val="15"/>
         </w:rPr>
-        <w:t xml:space="preserve">https://apowles.github.io/AP/Birley%20IGCSE%20Vocab%20and%20Gr%20EWs.html</w:t>
+        <w:t xml:space="preserve">https://apowles.github.io/AP/Eton%20IGCSE%20Vocab%20and%20Gr%20EWs.html</w:t>
       </w:r>
     </w:p>
     <w:p>
@@ -1543,7 +1543,7 @@
             <w:szCs w:val="24"/>
             <w:u w:val="single"/>
           </w:rPr>
-          <w:t xml:space="preserve">▶ Open Birley Italian Verbs</w:t>
+          <w:t xml:space="preserve">▶ Open Eton Italian Verbs</w:t>
         </w:r>
       </w:hyperlink>
     </w:p>
@@ -1558,7 +1558,7 @@
           <w:sz w:val="15"/>
           <w:szCs w:val="15"/>
         </w:rPr>
-        <w:t xml:space="preserve">https://apowles.github.io/AP/Birley%20Italian%20Verbs.html</w:t>
+        <w:t xml:space="preserve">https://apowles.github.io/AP/Eton%20Italian%20Verbs.html</w:t>
       </w:r>
     </w:p>
     <w:p>
@@ -1872,7 +1872,7 @@
             <w:szCs w:val="24"/>
             <w:u w:val="single"/>
           </w:rPr>
-          <w:t xml:space="preserve">▶ Open Birley IGCSE Vocab and Gr EWs</w:t>
+          <w:t xml:space="preserve">▶ Open Eton IGCSE Vocab and Gr EWs</w:t>
         </w:r>
       </w:hyperlink>
     </w:p>
@@ -1887,7 +1887,7 @@
           <w:sz w:val="15"/>
           <w:szCs w:val="15"/>
         </w:rPr>
-        <w:t xml:space="preserve">https://apowles.github.io/AP/Birley%20IGCSE%20Vocab%20and%20Gr%20EWs.html</w:t>
+        <w:t xml:space="preserve">https://apowles.github.io/AP/Eton%20IGCSE%20Vocab%20and%20Gr%20EWs.html</w:t>
       </w:r>
     </w:p>
     <w:p>
@@ -2631,7 +2631,7 @@
             <w:szCs w:val="24"/>
             <w:u w:val="single"/>
           </w:rPr>
-          <w:t xml:space="preserve">▶ Open Birley IGCSE Vocab and Gr EWs</w:t>
+          <w:t xml:space="preserve">▶ Open Eton IGCSE Vocab and Gr EWs</w:t>
         </w:r>
       </w:hyperlink>
     </w:p>
@@ -2646,7 +2646,7 @@
           <w:sz w:val="15"/>
           <w:szCs w:val="15"/>
         </w:rPr>
-        <w:t xml:space="preserve">https://apowles.github.io/AP/Birley%20IGCSE%20Vocab%20and%20Gr%20EWs.html</w:t>
+        <w:t xml:space="preserve">https://apowles.github.io/AP/Eton%20IGCSE%20Vocab%20and%20Gr%20EWs.html</w:t>
       </w:r>
     </w:p>
     <w:p>
@@ -2976,7 +2976,7 @@
             <w:szCs w:val="24"/>
             <w:u w:val="single"/>
           </w:rPr>
-          <w:t xml:space="preserve">▶ Open Birley IGCSE Structures &amp; Oral</w:t>
+          <w:t xml:space="preserve">▶ Open Eton IGCSE Structures &amp; Oral</w:t>
         </w:r>
       </w:hyperlink>
     </w:p>
@@ -2991,7 +2991,7 @@
           <w:sz w:val="15"/>
           <w:szCs w:val="15"/>
         </w:rPr>
-        <w:t xml:space="preserve">https://apowles.github.io/AP/Birley%20IGCSE%20Structures%20%26%20Oral%20and%20Writing%20Practice.html</w:t>
+        <w:t xml:space="preserve">https://apowles.github.io/AP/Eton%20IGCSE%20Structures%20%26%20Oral%20and%20Writing%20Practice.html</w:t>
       </w:r>
     </w:p>
     <w:p>
@@ -3231,7 +3231,7 @@
             <w:szCs w:val="24"/>
             <w:u w:val="single"/>
           </w:rPr>
-          <w:t xml:space="preserve">▶ Open Birley A Level Oral Phrase Bank</w:t>
+          <w:t xml:space="preserve">▶ Open Eton A Level Oral Phrase Bank</w:t>
         </w:r>
       </w:hyperlink>
     </w:p>
@@ -3246,7 +3246,7 @@
           <w:sz w:val="15"/>
           <w:szCs w:val="15"/>
         </w:rPr>
-        <w:t xml:space="preserve">https://apowles.github.io/AP/Birley%20A%20Level%20Oral%20Phrase%20Bank.html</w:t>
+        <w:t xml:space="preserve">https://apowles.github.io/AP/Eton%20A%20Level%20Oral%20Phrase%20Bank.html</w:t>
       </w:r>
     </w:p>
     <w:p>
@@ -3382,7 +3382,7 @@
           <w:sz w:val="22"/>
           <w:szCs w:val="22"/>
         </w:rPr>
-        <w:t xml:space="preserve">Birley Essential Phrases</w:t>
+        <w:t xml:space="preserve">Eton Essential Phrases</w:t>
       </w:r>
       <w:r>
         <w:rPr>
@@ -3432,7 +3432,7 @@
             <w:szCs w:val="24"/>
             <w:u w:val="single"/>
           </w:rPr>
-          <w:t xml:space="preserve">▶ Open Birley Essential Phrases</w:t>
+          <w:t xml:space="preserve">▶ Open Eton Essential Phrases</w:t>
         </w:r>
       </w:hyperlink>
     </w:p>
@@ -3447,7 +3447,7 @@
           <w:sz w:val="15"/>
           <w:szCs w:val="15"/>
         </w:rPr>
-        <w:t xml:space="preserve">https://apowles.github.io/AP/Birley%20Gen%20Essential%20Phrases.html</w:t>
+        <w:t xml:space="preserve">https://apowles.github.io/AP/Eton%20Gen%20Essential%20Phrases.html</w:t>
       </w:r>
     </w:p>
     <w:tbl>
@@ -3598,7 +3598,7 @@
             <w:szCs w:val="24"/>
             <w:u w:val="single"/>
           </w:rPr>
-          <w:t xml:space="preserve">▶ Open Birley IGCSE Italian Listening</w:t>
+          <w:t xml:space="preserve">▶ Open Eton IGCSE Italian Listening</w:t>
         </w:r>
       </w:hyperlink>
     </w:p>
@@ -3613,7 +3613,7 @@
           <w:sz w:val="15"/>
           <w:szCs w:val="15"/>
         </w:rPr>
-        <w:t xml:space="preserve">https://apowles.github.io/AP/Birley%20IGCSE%20Italian%20Listening.html</w:t>
+        <w:t xml:space="preserve">https://apowles.github.io/AP/Eton%20IGCSE%20Italian%20Listening.html</w:t>
       </w:r>
     </w:p>
     <w:p>
@@ -3641,7 +3641,7 @@
           <w:sz w:val="22"/>
           <w:szCs w:val="22"/>
         </w:rPr>
-        <w:t xml:space="preserve">Birley IGCSE Italian Listening</w:t>
+        <w:t xml:space="preserve">Eton IGCSE Italian Listening</w:t>
       </w:r>
       <w:r>
         <w:rPr>
@@ -3731,7 +3731,7 @@
           <w:sz w:val="22"/>
           <w:szCs w:val="22"/>
         </w:rPr>
-        <w:t xml:space="preserve">Birley IGCSE Vocab and Gr EWs</w:t>
+        <w:t xml:space="preserve">Eton IGCSE Vocab and Gr EWs</w:t>
       </w:r>
       <w:r>
         <w:rPr>
@@ -3939,7 +3939,7 @@
             <w:szCs w:val="24"/>
             <w:u w:val="single"/>
           </w:rPr>
-          <w:t xml:space="preserve">▶ Open Birley French Verbs</w:t>
+          <w:t xml:space="preserve">▶ Open Eton French Verbs</w:t>
         </w:r>
       </w:hyperlink>
     </w:p>
@@ -3954,7 +3954,7 @@
           <w:sz w:val="15"/>
           <w:szCs w:val="15"/>
         </w:rPr>
-        <w:t xml:space="preserve">https://apowles.github.io/AP/Birley%20French%20Verbs.html</w:t>
+        <w:t xml:space="preserve">https://apowles.github.io/AP/Eton%20French%20Verbs.html</w:t>
       </w:r>
     </w:p>
     <w:p>
@@ -4212,7 +4212,7 @@
             <w:szCs w:val="24"/>
             <w:u w:val="single"/>
           </w:rPr>
-          <w:t xml:space="preserve">▶ Open Birley A Level French VVs &amp; Gr EWs &amp; Translation</w:t>
+          <w:t xml:space="preserve">▶ Open Eton A Level French VVs &amp; Gr EWs &amp; Translation</w:t>
         </w:r>
       </w:hyperlink>
     </w:p>
@@ -4227,7 +4227,7 @@
           <w:sz w:val="15"/>
           <w:szCs w:val="15"/>
         </w:rPr>
-        <w:t xml:space="preserve">https://apowles.github.io/AP/Birley%20A%20Level%20French%20VVs%20%26%20Gr%20EWs%20%26%20Grammar%20Translation%20Practice%20and%20Drills.html</w:t>
+        <w:t xml:space="preserve">https://apowles.github.io/AP/Eton%20A%20Level%20French%20VVs%20%26%20Gr%20EWs%20%26%20Grammar%20Translation%20Practice%20and%20Drills.html</w:t>
       </w:r>
     </w:p>
     <w:p>
@@ -4665,7 +4665,7 @@
             <w:szCs w:val="24"/>
             <w:u w:val="single"/>
           </w:rPr>
-          <w:t xml:space="preserve">▶ Open Birley A Level French VVs &amp; Gr EWs &amp; Translation</w:t>
+          <w:t xml:space="preserve">▶ Open Eton A Level French VVs &amp; Gr EWs &amp; Translation</w:t>
         </w:r>
       </w:hyperlink>
     </w:p>
@@ -4680,7 +4680,7 @@
           <w:sz w:val="15"/>
           <w:szCs w:val="15"/>
         </w:rPr>
-        <w:t xml:space="preserve">https://apowles.github.io/AP/Birley%20A%20Level%20French%20VVs%20%26%20Gr%20EWs%20%26%20Grammar%20Translation%20Practice%20and%20Drills.html</w:t>
+        <w:t xml:space="preserve">https://apowles.github.io/AP/Eton%20A%20Level%20French%20VVs%20%26%20Gr%20EWs%20%26%20Grammar%20Translation%20Practice%20and%20Drills.html</w:t>
       </w:r>
     </w:p>
     <w:p>
@@ -4866,7 +4866,7 @@
             <w:szCs w:val="24"/>
             <w:u w:val="single"/>
           </w:rPr>
-          <w:t xml:space="preserve">▶ Open Birley A Level French VVs &amp; Gr EWs &amp; Translation</w:t>
+          <w:t xml:space="preserve">▶ Open Eton A Level French VVs &amp; Gr EWs &amp; Translation</w:t>
         </w:r>
       </w:hyperlink>
     </w:p>
@@ -4881,7 +4881,7 @@
           <w:sz w:val="15"/>
           <w:szCs w:val="15"/>
         </w:rPr>
-        <w:t xml:space="preserve">https://apowles.github.io/AP/Birley%20A%20Level%20French%20VVs%20%26%20Gr%20EWs%20%26%20Grammar%20Translation%20Practice%20and%20Drills.html</w:t>
+        <w:t xml:space="preserve">https://apowles.github.io/AP/Eton%20A%20Level%20French%20VVs%20%26%20Gr%20EWs%20%26%20Grammar%20Translation%20Practice%20and%20Drills.html</w:t>
       </w:r>
     </w:p>
     <w:p>
@@ -4964,7 +4964,7 @@
             <w:szCs w:val="24"/>
             <w:u w:val="single"/>
           </w:rPr>
-          <w:t xml:space="preserve">▶ Open Birley IGCSE Vocab and Gr EWs (French vocab and GCSE grammar)</w:t>
+          <w:t xml:space="preserve">▶ Open Eton IGCSE Vocab and Gr EWs (French vocab and GCSE grammar)</w:t>
         </w:r>
       </w:hyperlink>
     </w:p>
@@ -4979,7 +4979,7 @@
           <w:sz w:val="15"/>
           <w:szCs w:val="15"/>
         </w:rPr>
-        <w:t xml:space="preserve">https://apowles.github.io/AP/Birley%20IGCSE%20Vocab%20and%20Gr%20EWs.html</w:t>
+        <w:t xml:space="preserve">https://apowles.github.io/AP/Eton%20IGCSE%20Vocab%20and%20Gr%20EWs.html</w:t>
       </w:r>
     </w:p>
     <w:p>
@@ -5088,7 +5088,7 @@
             <w:szCs w:val="24"/>
             <w:u w:val="single"/>
           </w:rPr>
-          <w:t xml:space="preserve">▶ Open Birley A Level French Oral Topics &amp; Paper 1</w:t>
+          <w:t xml:space="preserve">▶ Open Eton A Level French Oral Topics &amp; Paper 1</w:t>
         </w:r>
       </w:hyperlink>
     </w:p>
@@ -5103,7 +5103,7 @@
           <w:sz w:val="15"/>
           <w:szCs w:val="15"/>
         </w:rPr>
-        <w:t xml:space="preserve">https://apowles.github.io/AP/Birley%20A%20Level%20French%20Oral%20Topics%20%26%20Paper%201%20Practice.html</w:t>
+        <w:t xml:space="preserve">https://apowles.github.io/AP/Eton%20A%20Level%20French%20Oral%20Topics%20%26%20Paper%201%20Practice.html</w:t>
       </w:r>
     </w:p>
     <w:p>
@@ -5505,7 +5505,7 @@
             <w:szCs w:val="24"/>
             <w:u w:val="single"/>
           </w:rPr>
-          <w:t xml:space="preserve">▶ Open Birley A Level Oral Phrase Bank</w:t>
+          <w:t xml:space="preserve">▶ Open Eton A Level Oral Phrase Bank</w:t>
         </w:r>
       </w:hyperlink>
     </w:p>
@@ -5520,7 +5520,7 @@
           <w:sz w:val="15"/>
           <w:szCs w:val="15"/>
         </w:rPr>
-        <w:t xml:space="preserve">https://apowles.github.io/AP/Birley%20A%20Level%20Oral%20Phrase%20Bank.html</w:t>
+        <w:t xml:space="preserve">https://apowles.github.io/AP/Eton%20A%20Level%20Oral%20Phrase%20Bank.html</w:t>
       </w:r>
     </w:p>
     <w:p>
@@ -5602,7 +5602,7 @@
           <w:sz w:val="22"/>
           <w:szCs w:val="22"/>
         </w:rPr>
-        <w:t xml:space="preserve">Birley Essential Phrases</w:t>
+        <w:t xml:space="preserve">Eton Essential Phrases</w:t>
       </w:r>
       <w:r>
         <w:rPr>
@@ -5729,7 +5729,7 @@
           <w:sz w:val="15"/>
           <w:szCs w:val="15"/>
         </w:rPr>
-        <w:t xml:space="preserve">https://apowles.github.io/AP/Birley%20A%20Level%20French%20VVs%20%26%20Gr%20EWs%20%26%20Grammar%20Translation%20Practice%20and%20Drills.html</w:t>
+        <w:t xml:space="preserve">https://apowles.github.io/AP/Eton%20A%20Level%20French%20VVs%20%26%20Gr%20EWs%20%26%20Grammar%20Translation%20Practice%20and%20Drills.html</w:t>
       </w:r>
     </w:p>
     <w:p>
@@ -5990,7 +5990,7 @@
                   <w:szCs w:val="20"/>
                   <w:u w:val="single"/>
                 </w:rPr>
-                <w:t xml:space="preserve">Birley Italian Verbs</w:t>
+                <w:t xml:space="preserve">Eton Italian Verbs</w:t>
               </w:r>
             </w:hyperlink>
           </w:p>
@@ -6094,7 +6094,7 @@
                   <w:szCs w:val="20"/>
                   <w:u w:val="single"/>
                 </w:rPr>
-                <w:t xml:space="preserve">Birley French Verbs</w:t>
+                <w:t xml:space="preserve">Eton French Verbs</w:t>
               </w:r>
             </w:hyperlink>
           </w:p>
@@ -6195,7 +6195,7 @@
                   <w:szCs w:val="20"/>
                   <w:u w:val="single"/>
                 </w:rPr>
-                <w:t xml:space="preserve">Birley IGCSE Vocab and Gr EWs</w:t>
+                <w:t xml:space="preserve">Eton IGCSE Vocab and Gr EWs</w:t>
               </w:r>
             </w:hyperlink>
           </w:p>
@@ -6299,7 +6299,7 @@
                   <w:szCs w:val="20"/>
                   <w:u w:val="single"/>
                 </w:rPr>
-                <w:t xml:space="preserve">Birley A Level French VVs &amp; Gr EWs &amp; Translation</w:t>
+                <w:t xml:space="preserve">Eton A Level French VVs &amp; Gr EWs &amp; Translation</w:t>
               </w:r>
             </w:hyperlink>
           </w:p>
@@ -6400,7 +6400,7 @@
                   <w:szCs w:val="20"/>
                   <w:u w:val="single"/>
                 </w:rPr>
-                <w:t xml:space="preserve">Birley IGCSE Vocab and Gr EWs</w:t>
+                <w:t xml:space="preserve">Eton IGCSE Vocab and Gr EWs</w:t>
               </w:r>
             </w:hyperlink>
           </w:p>
@@ -7090,7 +7090,7 @@
             <w:szCs w:val="24"/>
             <w:u w:val="single"/>
           </w:rPr>
-          <w:t xml:space="preserve">▶ Open Birley Italian Verbs</w:t>
+          <w:t xml:space="preserve">▶ Open Eton Italian Verbs</w:t>
         </w:r>
       </w:hyperlink>
     </w:p>
@@ -7105,7 +7105,7 @@
           <w:sz w:val="15"/>
           <w:szCs w:val="15"/>
         </w:rPr>
-        <w:t xml:space="preserve">https://apowles.github.io/AP/Birley%20Italian%20Verbs.html</w:t>
+        <w:t xml:space="preserve">https://apowles.github.io/AP/Eton%20Italian%20Verbs.html</w:t>
       </w:r>
     </w:p>
     <w:p>
@@ -7124,7 +7124,7 @@
             <w:szCs w:val="24"/>
             <w:u w:val="single"/>
           </w:rPr>
-          <w:t xml:space="preserve">▶ Open Birley French Verbs</w:t>
+          <w:t xml:space="preserve">▶ Open Eton French Verbs</w:t>
         </w:r>
       </w:hyperlink>
     </w:p>
@@ -7139,7 +7139,7 @@
           <w:sz w:val="15"/>
           <w:szCs w:val="15"/>
         </w:rPr>
-        <w:t xml:space="preserve">https://apowles.github.io/AP/Birley%20French%20Verbs.html</w:t>
+        <w:t xml:space="preserve">https://apowles.github.io/AP/Eton%20French%20Verbs.html</w:t>
       </w:r>
     </w:p>
     <w:p>
@@ -7158,7 +7158,7 @@
             <w:szCs w:val="24"/>
             <w:u w:val="single"/>
           </w:rPr>
-          <w:t xml:space="preserve">▶ Open Birley IGCSE Vocab and Gr EWs</w:t>
+          <w:t xml:space="preserve">▶ Open Eton IGCSE Vocab and Gr EWs</w:t>
         </w:r>
       </w:hyperlink>
     </w:p>
@@ -7173,7 +7173,7 @@
           <w:sz w:val="15"/>
           <w:szCs w:val="15"/>
         </w:rPr>
-        <w:t xml:space="preserve">https://apowles.github.io/AP/Birley%20IGCSE%20Vocab%20and%20Gr%20EWs.html</w:t>
+        <w:t xml:space="preserve">https://apowles.github.io/AP/Eton%20IGCSE%20Vocab%20and%20Gr%20EWs.html</w:t>
       </w:r>
     </w:p>
     <w:p>
@@ -7192,7 +7192,7 @@
             <w:szCs w:val="24"/>
             <w:u w:val="single"/>
           </w:rPr>
-          <w:t xml:space="preserve">▶ Open Birley IGCSE Structures &amp; Oral</w:t>
+          <w:t xml:space="preserve">▶ Open Eton IGCSE Structures &amp; Oral</w:t>
         </w:r>
       </w:hyperlink>
     </w:p>
@@ -7207,7 +7207,7 @@
           <w:sz w:val="15"/>
           <w:szCs w:val="15"/>
         </w:rPr>
-        <w:t xml:space="preserve">https://apowles.github.io/AP/Birley%20IGCSE%20Structures%20%26%20Oral%20and%20Writing%20Practice.html</w:t>
+        <w:t xml:space="preserve">https://apowles.github.io/AP/Eton%20IGCSE%20Structures%20%26%20Oral%20and%20Writing%20Practice.html</w:t>
       </w:r>
     </w:p>
     <w:p>
@@ -7226,7 +7226,7 @@
             <w:szCs w:val="24"/>
             <w:u w:val="single"/>
           </w:rPr>
-          <w:t xml:space="preserve">▶ Open Birley A Level Oral Phrase Bank</w:t>
+          <w:t xml:space="preserve">▶ Open Eton A Level Oral Phrase Bank</w:t>
         </w:r>
       </w:hyperlink>
     </w:p>
@@ -7241,7 +7241,7 @@
           <w:sz w:val="15"/>
           <w:szCs w:val="15"/>
         </w:rPr>
-        <w:t xml:space="preserve">https://apowles.github.io/AP/Birley%20A%20Level%20Oral%20Phrase%20Bank.html</w:t>
+        <w:t xml:space="preserve">https://apowles.github.io/AP/Eton%20A%20Level%20Oral%20Phrase%20Bank.html</w:t>
       </w:r>
     </w:p>
     <w:p>
@@ -7260,7 +7260,7 @@
             <w:szCs w:val="24"/>
             <w:u w:val="single"/>
           </w:rPr>
-          <w:t xml:space="preserve">▶ Open Birley Essential Phrases</w:t>
+          <w:t xml:space="preserve">▶ Open Eton Essential Phrases</w:t>
         </w:r>
       </w:hyperlink>
     </w:p>
@@ -7275,7 +7275,7 @@
           <w:sz w:val="15"/>
           <w:szCs w:val="15"/>
         </w:rPr>
-        <w:t xml:space="preserve">https://apowles.github.io/AP/Birley%20Gen%20Essential%20Phrases.html</w:t>
+        <w:t xml:space="preserve">https://apowles.github.io/AP/Eton%20Gen%20Essential%20Phrases.html</w:t>
       </w:r>
     </w:p>
     <w:p>
@@ -7294,7 +7294,7 @@
             <w:szCs w:val="24"/>
             <w:u w:val="single"/>
           </w:rPr>
-          <w:t xml:space="preserve">▶ Open Birley A Level French VVs &amp; Gr EWs &amp; Translation</w:t>
+          <w:t xml:space="preserve">▶ Open Eton A Level French VVs &amp; Gr EWs &amp; Translation</w:t>
         </w:r>
       </w:hyperlink>
     </w:p>
@@ -7309,7 +7309,7 @@
           <w:sz w:val="15"/>
           <w:szCs w:val="15"/>
         </w:rPr>
-        <w:t xml:space="preserve">https://apowles.github.io/AP/Birley%20A%20Level%20French%20VVs%20%26%20Gr%20EWs%20%26%20Grammar%20Translation%20Practice%20and%20Drills.html</w:t>
+        <w:t xml:space="preserve">https://apowles.github.io/AP/Eton%20A%20Level%20French%20VVs%20%26%20Gr%20EWs%20%26%20Grammar%20Translation%20Practice%20and%20Drills.html</w:t>
       </w:r>
     </w:p>
     <w:p>
@@ -7328,7 +7328,7 @@
             <w:szCs w:val="24"/>
             <w:u w:val="single"/>
           </w:rPr>
-          <w:t xml:space="preserve">▶ Open Birley A Level French Oral Topics &amp; Paper 1</w:t>
+          <w:t xml:space="preserve">▶ Open Eton A Level French Oral Topics &amp; Paper 1</w:t>
         </w:r>
       </w:hyperlink>
     </w:p>
@@ -7343,7 +7343,7 @@
           <w:sz w:val="15"/>
           <w:szCs w:val="15"/>
         </w:rPr>
-        <w:t xml:space="preserve">https://apowles.github.io/AP/Birley%20A%20Level%20French%20Oral%20Topics%20%26%20Paper%201%20Practice.html</w:t>
+        <w:t xml:space="preserve">https://apowles.github.io/AP/Eton%20A%20Level%20French%20Oral%20Topics%20%26%20Paper%201%20Practice.html</w:t>
       </w:r>
     </w:p>
     <w:p>
@@ -7362,7 +7362,7 @@
             <w:szCs w:val="24"/>
             <w:u w:val="single"/>
           </w:rPr>
-          <w:t xml:space="preserve">▶ Open Birley IGCSE Italian Listening</w:t>
+          <w:t xml:space="preserve">▶ Open Eton IGCSE Italian Listening</w:t>
         </w:r>
       </w:hyperlink>
     </w:p>
@@ -7377,7 +7377,7 @@
           <w:sz w:val="15"/>
           <w:szCs w:val="15"/>
         </w:rPr>
-        <w:t xml:space="preserve">https://apowles.github.io/AP/Birley%20IGCSE%20Italian%20Listening.html</w:t>
+        <w:t xml:space="preserve">https://apowles.github.io/AP/Eton%20IGCSE%20Italian%20Listening.html</w:t>
       </w:r>
     </w:p>
     <w:p>

</xml_diff>